<commit_message>
Updated solution to the problem statement.
</commit_message>
<xml_diff>
--- a/Problem Identification Assignments/Problem Identification Assignments.docx
+++ b/Problem Identification Assignments/Problem Identification Assignments.docx
@@ -17,16 +17,10 @@
         </w:numPr>
       </w:pPr>
       <w:r>
-        <w:t>How will you achieve this in AI? Conduct</w:t>
+        <w:t xml:space="preserve">How will you achieve this in AI? </w:t>
       </w:r>
       <w:r>
-        <w:t xml:space="preserve"> </w:t>
-      </w:r>
-      <w:r>
-        <w:t xml:space="preserve">an </w:t>
-      </w:r>
-      <w:r>
-        <w:t>employee satisfaction survey (input).</w:t>
+        <w:t>Prediction.</w:t>
       </w:r>
     </w:p>
     <w:p>
@@ -72,16 +66,7 @@
         </w:numPr>
       </w:pPr>
       <w:r>
-        <w:t>Stage-</w:t>
-      </w:r>
-      <w:r>
-        <w:t>2</w:t>
-      </w:r>
-      <w:r>
-        <w:t>:</w:t>
-      </w:r>
-      <w:r>
-        <w:t xml:space="preserve"> We know the input (i.e. data from the survey) and the output (i.e. an employee is going to stay or leave). It is </w:t>
+        <w:t xml:space="preserve">Stage-2: We know the input (i.e. data from the survey) and the output (i.e. an employee is going to stay or leave). It is </w:t>
       </w:r>
       <w:r>
         <w:rPr>
@@ -150,37 +135,46 @@
       <w:pPr>
         <w:pStyle w:val="ListParagraph"/>
       </w:pPr>
-      <w:r>
-        <w:object w:dxaOrig="1538" w:dyaOrig="993" w14:anchorId="2F27FE5D">
-          <v:shapetype id="_x0000_t75" coordsize="21600,21600" o:spt="75" o:preferrelative="t" path="m@4@5l@4@11@9@11@9@5xe" filled="f" stroked="f">
-            <v:stroke joinstyle="miter"/>
-            <v:formulas>
-              <v:f eqn="if lineDrawn pixelLineWidth 0"/>
-              <v:f eqn="sum @0 1 0"/>
-              <v:f eqn="sum 0 0 @1"/>
-              <v:f eqn="prod @2 1 2"/>
-              <v:f eqn="prod @3 21600 pixelWidth"/>
-              <v:f eqn="prod @3 21600 pixelHeight"/>
-              <v:f eqn="sum @0 0 1"/>
-              <v:f eqn="prod @6 1 2"/>
-              <v:f eqn="prod @7 21600 pixelWidth"/>
-              <v:f eqn="sum @8 21600 0"/>
-              <v:f eqn="prod @7 21600 pixelHeight"/>
-              <v:f eqn="sum @10 21600 0"/>
-            </v:formulas>
-            <v:path o:extrusionok="f" gradientshapeok="t" o:connecttype="rect"/>
-            <o:lock v:ext="edit" aspectratio="t"/>
-          </v:shapetype>
-          <v:shape id="_x0000_i1025" type="#_x0000_t75" style="width:77.25pt;height:49.5pt" o:ole="">
-            <v:imagedata r:id="rId5" o:title=""/>
-          </v:shape>
-          <o:OLEObject Type="Link" ProgID="Excel.Sheet.12" ShapeID="_x0000_i1025" DrawAspect="Icon" r:id="rId6" UpdateMode="Always">
-            <o:LinkType>EnhancedMetaFile</o:LinkType>
-            <o:LockedField>false</o:LockedField>
-            <o:FieldCodes>\f 0</o:FieldCodes>
-          </o:OLEObject>
-        </w:object>
-      </w:r>
+      <w:hyperlink r:id="rId5" w:history="1">
+        <w:r>
+          <w:fldChar w:fldCharType="begin"/>
+        </w:r>
+        <w:r>
+          <w:instrText xml:space="preserve"> LINK Excel.Sheet.12 "C:\\Users\\Kannadoss R\\Downloads\\Dummy_Employee_Attrition_Dataset.xlsx" "" \a \p \f 0 </w:instrText>
+        </w:r>
+        <w:r>
+          <w:fldChar w:fldCharType="separate"/>
+        </w:r>
+        <w:r>
+          <w:object w:dxaOrig="1538" w:dyaOrig="993" w14:anchorId="2F27FE5D">
+            <v:shapetype id="_x0000_t75" coordsize="21600,21600" o:spt="75" o:preferrelative="t" path="m@4@5l@4@11@9@11@9@5xe" filled="f" stroked="f">
+              <v:stroke joinstyle="miter"/>
+              <v:formulas>
+                <v:f eqn="if lineDrawn pixelLineWidth 0"/>
+                <v:f eqn="sum @0 1 0"/>
+                <v:f eqn="sum 0 0 @1"/>
+                <v:f eqn="prod @2 1 2"/>
+                <v:f eqn="prod @3 21600 pixelWidth"/>
+                <v:f eqn="prod @3 21600 pixelHeight"/>
+                <v:f eqn="sum @0 0 1"/>
+                <v:f eqn="prod @6 1 2"/>
+                <v:f eqn="prod @7 21600 pixelWidth"/>
+                <v:f eqn="sum @8 21600 0"/>
+                <v:f eqn="prod @7 21600 pixelHeight"/>
+                <v:f eqn="sum @10 21600 0"/>
+              </v:formulas>
+              <v:path o:extrusionok="f" gradientshapeok="t" o:connecttype="rect"/>
+              <o:lock v:ext="edit" aspectratio="t"/>
+            </v:shapetype>
+            <v:shape id="_x0000_i1025" type="#_x0000_t75" style="width:77.25pt;height:49.5pt" o:ole="">
+              <v:imagedata r:id="rId6" o:title=""/>
+            </v:shape>
+          </w:object>
+        </w:r>
+        <w:r>
+          <w:fldChar w:fldCharType="end"/>
+        </w:r>
+      </w:hyperlink>
     </w:p>
     <w:p>
       <w:pPr>
@@ -1081,6 +1075,7 @@
   <w:style w:type="character" w:default="1" w:styleId="DefaultParagraphFont">
     <w:name w:val="Default Paragraph Font"/>
     <w:uiPriority w:val="1"/>
+    <w:semiHidden/>
     <w:unhideWhenUsed/>
   </w:style>
   <w:style w:type="table" w:default="1" w:styleId="TableNormal">

</xml_diff>